<commit_message>
Finalize Round 22 gate fixes and rebuild release artifacts
</commit_message>
<xml_diff>
--- a/重构版论文_v4_20260915/材料完整性清单.docx
+++ b/重构版论文_v4_20260915/材料完整性清单.docx
@@ -834,7 +834,7 @@
               <w:rPr>
                 <w:sz w:val="16"/>
               </w:rPr>
-              <w:t>10</w:t>
+              <w:t>11</w:t>
             </w:r>
           </w:p>
         </w:tc>
@@ -1551,7 +1551,7 @@
               <w:rPr>
                 <w:sz w:val="16"/>
               </w:rPr>
-              <w:t>180</w:t>
+              <w:t>181</w:t>
             </w:r>
           </w:p>
         </w:tc>
@@ -2220,7 +2220,7 @@
               <w:rPr>
                 <w:sz w:val="16"/>
               </w:rPr>
-              <w:t>26.8 MB</w:t>
+              <w:t>26.5 MB</w:t>
             </w:r>
           </w:p>
         </w:tc>
@@ -8805,28 +8805,28 @@
               <w:rPr>
                 <w:sz w:val="16"/>
               </w:rPr>
-              <w:t>142</w:t>
-            </w:r>
-          </w:p>
-        </w:tc>
-        <w:tc>
-          <w:tcPr>
-            <w:tcW w:type="dxa" w:w="1958"/>
-          </w:tcPr>
-          <w:p>
-            <w:pPr>
-              <w:spacing w:after="0"/>
-            </w:pPr>
-            <w:r>
-              <w:rPr>
-                <w:sz w:val="16"/>
-              </w:rPr>
-            </w:r>
-            <w:r>
-              <w:rPr>
-                <w:sz w:val="16"/>
-              </w:rPr>
-              <w:t>7.4 MB</w:t>
+              <w:t>144</w:t>
+            </w:r>
+          </w:p>
+        </w:tc>
+        <w:tc>
+          <w:tcPr>
+            <w:tcW w:type="dxa" w:w="1958"/>
+          </w:tcPr>
+          <w:p>
+            <w:pPr>
+              <w:spacing w:after="0"/>
+            </w:pPr>
+            <w:r>
+              <w:rPr>
+                <w:sz w:val="16"/>
+              </w:rPr>
+            </w:r>
+            <w:r>
+              <w:rPr>
+                <w:sz w:val="16"/>
+              </w:rPr>
+              <w:t>8.5 MB</w:t>
             </w:r>
           </w:p>
         </w:tc>

</xml_diff>